<commit_message>
Relatório: secções de Monte Carlo e Apêndice G, como no relatório de referência
Co-Authored-By: Claude Opus 5.5 <noreply@anthropic.com>
</commit_message>
<xml_diff>
--- a/report/DSS_Report_Group2_Euronext.docx
+++ b/report/DSS_Report_Group2_Euronext.docx
@@ -308,7 +308,7 @@
         <w:rPr>
           <w:noProof/>
         </w:rPr>
-        <w:instrText xml:space="preserve"> PAGEREF _Toc243648110 \h </w:instrText>
+        <w:instrText xml:space="preserve"> PAGEREF _Toc243648497 \h </w:instrText>
       </w:r>
       <w:r>
         <w:rPr>
@@ -366,7 +366,7 @@
         <w:rPr>
           <w:noProof/>
         </w:rPr>
-        <w:instrText xml:space="preserve"> PAGEREF _Toc243648111 \h </w:instrText>
+        <w:instrText xml:space="preserve"> PAGEREF _Toc243648498 \h </w:instrText>
       </w:r>
       <w:r>
         <w:rPr>
@@ -424,7 +424,7 @@
         <w:rPr>
           <w:noProof/>
         </w:rPr>
-        <w:instrText xml:space="preserve"> PAGEREF _Toc243648112 \h </w:instrText>
+        <w:instrText xml:space="preserve"> PAGEREF _Toc243648499 \h </w:instrText>
       </w:r>
       <w:r>
         <w:rPr>
@@ -482,7 +482,7 @@
         <w:rPr>
           <w:noProof/>
         </w:rPr>
-        <w:instrText xml:space="preserve"> PAGEREF _Toc243648113 \h </w:instrText>
+        <w:instrText xml:space="preserve"> PAGEREF _Toc243648500 \h </w:instrText>
       </w:r>
       <w:r>
         <w:rPr>
@@ -540,7 +540,7 @@
         <w:rPr>
           <w:noProof/>
         </w:rPr>
-        <w:instrText xml:space="preserve"> PAGEREF _Toc243648114 \h </w:instrText>
+        <w:instrText xml:space="preserve"> PAGEREF _Toc243648501 \h </w:instrText>
       </w:r>
       <w:r>
         <w:rPr>
@@ -598,7 +598,7 @@
         <w:rPr>
           <w:noProof/>
         </w:rPr>
-        <w:instrText xml:space="preserve"> PAGEREF _Toc243648115 \h </w:instrText>
+        <w:instrText xml:space="preserve"> PAGEREF _Toc243648502 \h </w:instrText>
       </w:r>
       <w:r>
         <w:rPr>
@@ -656,7 +656,7 @@
         <w:rPr>
           <w:noProof/>
         </w:rPr>
-        <w:instrText xml:space="preserve"> PAGEREF _Toc243648116 \h </w:instrText>
+        <w:instrText xml:space="preserve"> PAGEREF _Toc243648503 \h </w:instrText>
       </w:r>
       <w:r>
         <w:rPr>
@@ -714,7 +714,7 @@
         <w:rPr>
           <w:noProof/>
         </w:rPr>
-        <w:instrText xml:space="preserve"> PAGEREF _Toc243648117 \h </w:instrText>
+        <w:instrText xml:space="preserve"> PAGEREF _Toc243648504 \h </w:instrText>
       </w:r>
       <w:r>
         <w:rPr>
@@ -772,7 +772,7 @@
         <w:rPr>
           <w:noProof/>
         </w:rPr>
-        <w:instrText xml:space="preserve"> PAGEREF _Toc243648118 \h </w:instrText>
+        <w:instrText xml:space="preserve"> PAGEREF _Toc243648505 \h </w:instrText>
       </w:r>
       <w:r>
         <w:rPr>
@@ -830,7 +830,7 @@
         <w:rPr>
           <w:noProof/>
         </w:rPr>
-        <w:instrText xml:space="preserve"> PAGEREF _Toc243648119 \h </w:instrText>
+        <w:instrText xml:space="preserve"> PAGEREF _Toc243648506 \h </w:instrText>
       </w:r>
       <w:r>
         <w:rPr>
@@ -888,7 +888,7 @@
         <w:rPr>
           <w:noProof/>
         </w:rPr>
-        <w:instrText xml:space="preserve"> PAGEREF _Toc243648120 \h </w:instrText>
+        <w:instrText xml:space="preserve"> PAGEREF _Toc243648507 \h </w:instrText>
       </w:r>
       <w:r>
         <w:rPr>
@@ -946,7 +946,7 @@
         <w:rPr>
           <w:noProof/>
         </w:rPr>
-        <w:instrText xml:space="preserve"> PAGEREF _Toc243648121 \h </w:instrText>
+        <w:instrText xml:space="preserve"> PAGEREF _Toc243648508 \h </w:instrText>
       </w:r>
       <w:r>
         <w:rPr>
@@ -1004,7 +1004,7 @@
         <w:rPr>
           <w:noProof/>
         </w:rPr>
-        <w:instrText xml:space="preserve"> PAGEREF _Toc243648122 \h </w:instrText>
+        <w:instrText xml:space="preserve"> PAGEREF _Toc243648509 \h </w:instrText>
       </w:r>
       <w:r>
         <w:rPr>
@@ -1062,7 +1062,7 @@
         <w:rPr>
           <w:noProof/>
         </w:rPr>
-        <w:instrText xml:space="preserve"> PAGEREF _Toc243648123 \h </w:instrText>
+        <w:instrText xml:space="preserve"> PAGEREF _Toc243648510 \h </w:instrText>
       </w:r>
       <w:r>
         <w:rPr>
@@ -1120,7 +1120,7 @@
         <w:rPr>
           <w:noProof/>
         </w:rPr>
-        <w:instrText xml:space="preserve"> PAGEREF _Toc243648124 \h </w:instrText>
+        <w:instrText xml:space="preserve"> PAGEREF _Toc243648511 \h </w:instrText>
       </w:r>
       <w:r>
         <w:rPr>
@@ -1178,7 +1178,7 @@
         <w:rPr>
           <w:noProof/>
         </w:rPr>
-        <w:instrText xml:space="preserve"> PAGEREF _Toc243648125 \h </w:instrText>
+        <w:instrText xml:space="preserve"> PAGEREF _Toc243648512 \h </w:instrText>
       </w:r>
       <w:r>
         <w:rPr>
@@ -1236,7 +1236,7 @@
         <w:rPr>
           <w:noProof/>
         </w:rPr>
-        <w:instrText xml:space="preserve"> PAGEREF _Toc243648126 \h </w:instrText>
+        <w:instrText xml:space="preserve"> PAGEREF _Toc243648513 \h </w:instrText>
       </w:r>
       <w:r>
         <w:rPr>
@@ -1294,7 +1294,7 @@
         <w:rPr>
           <w:noProof/>
         </w:rPr>
-        <w:instrText xml:space="preserve"> PAGEREF _Toc243648127 \h </w:instrText>
+        <w:instrText xml:space="preserve"> PAGEREF _Toc243648514 \h </w:instrText>
       </w:r>
       <w:r>
         <w:rPr>
@@ -1352,7 +1352,7 @@
         <w:rPr>
           <w:noProof/>
         </w:rPr>
-        <w:instrText xml:space="preserve"> PAGEREF _Toc243648128 \h </w:instrText>
+        <w:instrText xml:space="preserve"> PAGEREF _Toc243648515 \h </w:instrText>
       </w:r>
       <w:r>
         <w:rPr>
@@ -1410,7 +1410,7 @@
         <w:rPr>
           <w:noProof/>
         </w:rPr>
-        <w:instrText xml:space="preserve"> PAGEREF _Toc243648129 \h </w:instrText>
+        <w:instrText xml:space="preserve"> PAGEREF _Toc243648516 \h </w:instrText>
       </w:r>
       <w:r>
         <w:rPr>
@@ -1468,7 +1468,7 @@
         <w:rPr>
           <w:noProof/>
         </w:rPr>
-        <w:instrText xml:space="preserve"> PAGEREF _Toc243648130 \h </w:instrText>
+        <w:instrText xml:space="preserve"> PAGEREF _Toc243648517 \h </w:instrText>
       </w:r>
       <w:r>
         <w:rPr>
@@ -1526,7 +1526,7 @@
         <w:rPr>
           <w:noProof/>
         </w:rPr>
-        <w:instrText xml:space="preserve"> PAGEREF _Toc243648131 \h </w:instrText>
+        <w:instrText xml:space="preserve"> PAGEREF _Toc243648518 \h </w:instrText>
       </w:r>
       <w:r>
         <w:rPr>
@@ -1584,7 +1584,7 @@
         <w:rPr>
           <w:noProof/>
         </w:rPr>
-        <w:instrText xml:space="preserve"> PAGEREF _Toc243648132 \h </w:instrText>
+        <w:instrText xml:space="preserve"> PAGEREF _Toc243648519 \h </w:instrText>
       </w:r>
       <w:r>
         <w:rPr>
@@ -1642,7 +1642,7 @@
         <w:rPr>
           <w:noProof/>
         </w:rPr>
-        <w:instrText xml:space="preserve"> PAGEREF _Toc243648133 \h </w:instrText>
+        <w:instrText xml:space="preserve"> PAGEREF _Toc243648520 \h </w:instrText>
       </w:r>
       <w:r>
         <w:rPr>
@@ -1700,7 +1700,7 @@
         <w:rPr>
           <w:noProof/>
         </w:rPr>
-        <w:instrText xml:space="preserve"> PAGEREF _Toc243648134 \h </w:instrText>
+        <w:instrText xml:space="preserve"> PAGEREF _Toc243648521 \h </w:instrText>
       </w:r>
       <w:r>
         <w:rPr>
@@ -1758,7 +1758,7 @@
         <w:rPr>
           <w:noProof/>
         </w:rPr>
-        <w:instrText xml:space="preserve"> PAGEREF _Toc243648135 \h </w:instrText>
+        <w:instrText xml:space="preserve"> PAGEREF _Toc243648522 \h </w:instrText>
       </w:r>
       <w:r>
         <w:rPr>
@@ -1816,7 +1816,7 @@
         <w:rPr>
           <w:noProof/>
         </w:rPr>
-        <w:instrText xml:space="preserve"> PAGEREF _Toc243648136 \h </w:instrText>
+        <w:instrText xml:space="preserve"> PAGEREF _Toc243648523 \h </w:instrText>
       </w:r>
       <w:r>
         <w:rPr>
@@ -1874,7 +1874,7 @@
         <w:rPr>
           <w:noProof/>
         </w:rPr>
-        <w:instrText xml:space="preserve"> PAGEREF _Toc243648137 \h </w:instrText>
+        <w:instrText xml:space="preserve"> PAGEREF _Toc243648524 \h </w:instrText>
       </w:r>
       <w:r>
         <w:rPr>
@@ -1932,7 +1932,7 @@
         <w:rPr>
           <w:noProof/>
         </w:rPr>
-        <w:instrText xml:space="preserve"> PAGEREF _Toc243648138 \h </w:instrText>
+        <w:instrText xml:space="preserve"> PAGEREF _Toc243648525 \h </w:instrText>
       </w:r>
       <w:r>
         <w:rPr>
@@ -1990,7 +1990,7 @@
         <w:rPr>
           <w:noProof/>
         </w:rPr>
-        <w:instrText xml:space="preserve"> PAGEREF _Toc243648139 \h </w:instrText>
+        <w:instrText xml:space="preserve"> PAGEREF _Toc243648526 \h </w:instrText>
       </w:r>
       <w:r>
         <w:rPr>
@@ -2048,7 +2048,7 @@
         <w:rPr>
           <w:noProof/>
         </w:rPr>
-        <w:instrText xml:space="preserve"> PAGEREF _Toc243648140 \h </w:instrText>
+        <w:instrText xml:space="preserve"> PAGEREF _Toc243648527 \h </w:instrText>
       </w:r>
       <w:r>
         <w:rPr>
@@ -2106,7 +2106,7 @@
         <w:rPr>
           <w:noProof/>
         </w:rPr>
-        <w:instrText xml:space="preserve"> PAGEREF _Toc243648141 \h </w:instrText>
+        <w:instrText xml:space="preserve"> PAGEREF _Toc243648528 \h </w:instrText>
       </w:r>
       <w:r>
         <w:rPr>
@@ -2164,7 +2164,7 @@
         <w:rPr>
           <w:noProof/>
         </w:rPr>
-        <w:instrText xml:space="preserve"> PAGEREF _Toc243648142 \h </w:instrText>
+        <w:instrText xml:space="preserve"> PAGEREF _Toc243648529 \h </w:instrText>
       </w:r>
       <w:r>
         <w:rPr>
@@ -2222,7 +2222,7 @@
         <w:rPr>
           <w:noProof/>
         </w:rPr>
-        <w:instrText xml:space="preserve"> PAGEREF _Toc243648143 \h </w:instrText>
+        <w:instrText xml:space="preserve"> PAGEREF _Toc243648530 \h </w:instrText>
       </w:r>
       <w:r>
         <w:rPr>
@@ -2280,7 +2280,7 @@
         <w:rPr>
           <w:noProof/>
         </w:rPr>
-        <w:instrText xml:space="preserve"> PAGEREF _Toc243648144 \h </w:instrText>
+        <w:instrText xml:space="preserve"> PAGEREF _Toc243648531 \h </w:instrText>
       </w:r>
       <w:r>
         <w:rPr>
@@ -2338,7 +2338,7 @@
         <w:rPr>
           <w:noProof/>
         </w:rPr>
-        <w:instrText xml:space="preserve"> PAGEREF _Toc243648145 \h </w:instrText>
+        <w:instrText xml:space="preserve"> PAGEREF _Toc243648532 \h </w:instrText>
       </w:r>
       <w:r>
         <w:rPr>
@@ -2396,7 +2396,7 @@
         <w:rPr>
           <w:noProof/>
         </w:rPr>
-        <w:instrText xml:space="preserve"> PAGEREF _Toc243648146 \h </w:instrText>
+        <w:instrText xml:space="preserve"> PAGEREF _Toc243648533 \h </w:instrText>
       </w:r>
       <w:r>
         <w:rPr>
@@ -2454,7 +2454,7 @@
         <w:rPr>
           <w:noProof/>
         </w:rPr>
-        <w:instrText xml:space="preserve"> PAGEREF _Toc243648147 \h </w:instrText>
+        <w:instrText xml:space="preserve"> PAGEREF _Toc243648534 \h </w:instrText>
       </w:r>
       <w:r>
         <w:rPr>
@@ -2512,7 +2512,7 @@
         <w:rPr>
           <w:noProof/>
         </w:rPr>
-        <w:instrText xml:space="preserve"> PAGEREF _Toc243648148 \h </w:instrText>
+        <w:instrText xml:space="preserve"> PAGEREF _Toc243648535 \h </w:instrText>
       </w:r>
       <w:r>
         <w:rPr>
@@ -2570,7 +2570,65 @@
         <w:rPr>
           <w:noProof/>
         </w:rPr>
-        <w:instrText xml:space="preserve"> PAGEREF _Toc243648149 \h </w:instrText>
+        <w:instrText xml:space="preserve"> PAGEREF _Toc243648536 \h </w:instrText>
+      </w:r>
+      <w:r>
+        <w:rPr>
+          <w:noProof/>
+        </w:rPr>
+      </w:r>
+      <w:r>
+        <w:rPr>
+          <w:noProof/>
+        </w:rPr>
+        <w:fldChar w:fldCharType="separate"/>
+      </w:r>
+      <w:r>
+        <w:rPr>
+          <w:noProof/>
+        </w:rPr>
+        <w:t>13</w:t>
+      </w:r>
+      <w:r>
+        <w:rPr>
+          <w:noProof/>
+        </w:rPr>
+        <w:fldChar w:fldCharType="end"/>
+      </w:r>
+    </w:p>
+    <w:p>
+      <w:pPr>
+        <w:pStyle w:val="TOC2"/>
+        <w:tabs>
+          <w:tab w:val="right" w:leader="dot" w:pos="9061"/>
+        </w:tabs>
+        <w:rPr>
+          <w:noProof/>
+        </w:rPr>
+      </w:pPr>
+      <w:r>
+        <w:rPr>
+          <w:noProof/>
+        </w:rPr>
+        <w:t>7.7 Monte Carlo Replications</w:t>
+      </w:r>
+      <w:r>
+        <w:rPr>
+          <w:noProof/>
+        </w:rPr>
+        <w:tab/>
+      </w:r>
+      <w:r>
+        <w:rPr>
+          <w:noProof/>
+        </w:rPr>
+        <w:fldChar w:fldCharType="begin"/>
+      </w:r>
+      <w:r>
+        <w:rPr>
+          <w:noProof/>
+        </w:rPr>
+        <w:instrText xml:space="preserve"> PAGEREF _Toc243648537 \h </w:instrText>
       </w:r>
       <w:r>
         <w:rPr>
@@ -2628,7 +2686,7 @@
         <w:rPr>
           <w:noProof/>
         </w:rPr>
-        <w:instrText xml:space="preserve"> PAGEREF _Toc243648150 \h </w:instrText>
+        <w:instrText xml:space="preserve"> PAGEREF _Toc243648538 \h </w:instrText>
       </w:r>
       <w:r>
         <w:rPr>
@@ -2686,7 +2744,7 @@
         <w:rPr>
           <w:noProof/>
         </w:rPr>
-        <w:instrText xml:space="preserve"> PAGEREF _Toc243648151 \h </w:instrText>
+        <w:instrText xml:space="preserve"> PAGEREF _Toc243648539 \h </w:instrText>
       </w:r>
       <w:r>
         <w:rPr>
@@ -2744,7 +2802,7 @@
         <w:rPr>
           <w:noProof/>
         </w:rPr>
-        <w:instrText xml:space="preserve"> PAGEREF _Toc243648152 \h </w:instrText>
+        <w:instrText xml:space="preserve"> PAGEREF _Toc243648540 \h </w:instrText>
       </w:r>
       <w:r>
         <w:rPr>
@@ -2802,7 +2860,7 @@
         <w:rPr>
           <w:noProof/>
         </w:rPr>
-        <w:instrText xml:space="preserve"> PAGEREF _Toc243648153 \h </w:instrText>
+        <w:instrText xml:space="preserve"> PAGEREF _Toc243648541 \h </w:instrText>
       </w:r>
       <w:r>
         <w:rPr>
@@ -2860,7 +2918,7 @@
         <w:rPr>
           <w:noProof/>
         </w:rPr>
-        <w:instrText xml:space="preserve"> PAGEREF _Toc243648154 \h </w:instrText>
+        <w:instrText xml:space="preserve"> PAGEREF _Toc243648542 \h </w:instrText>
       </w:r>
       <w:r>
         <w:rPr>
@@ -2918,7 +2976,7 @@
         <w:rPr>
           <w:noProof/>
         </w:rPr>
-        <w:instrText xml:space="preserve"> PAGEREF _Toc243648155 \h </w:instrText>
+        <w:instrText xml:space="preserve"> PAGEREF _Toc243648543 \h </w:instrText>
       </w:r>
       <w:r>
         <w:rPr>
@@ -2976,7 +3034,65 @@
         <w:rPr>
           <w:noProof/>
         </w:rPr>
-        <w:instrText xml:space="preserve"> PAGEREF _Toc243648156 \h </w:instrText>
+        <w:instrText xml:space="preserve"> PAGEREF _Toc243648544 \h </w:instrText>
+      </w:r>
+      <w:r>
+        <w:rPr>
+          <w:noProof/>
+        </w:rPr>
+      </w:r>
+      <w:r>
+        <w:rPr>
+          <w:noProof/>
+        </w:rPr>
+        <w:fldChar w:fldCharType="separate"/>
+      </w:r>
+      <w:r>
+        <w:rPr>
+          <w:noProof/>
+        </w:rPr>
+        <w:t>14</w:t>
+      </w:r>
+      <w:r>
+        <w:rPr>
+          <w:noProof/>
+        </w:rPr>
+        <w:fldChar w:fldCharType="end"/>
+      </w:r>
+    </w:p>
+    <w:p>
+      <w:pPr>
+        <w:pStyle w:val="TOC2"/>
+        <w:tabs>
+          <w:tab w:val="right" w:leader="dot" w:pos="9061"/>
+        </w:tabs>
+        <w:rPr>
+          <w:noProof/>
+        </w:rPr>
+      </w:pPr>
+      <w:r>
+        <w:rPr>
+          <w:noProof/>
+        </w:rPr>
+        <w:t>8.7 Monte Carlo Replications</w:t>
+      </w:r>
+      <w:r>
+        <w:rPr>
+          <w:noProof/>
+        </w:rPr>
+        <w:tab/>
+      </w:r>
+      <w:r>
+        <w:rPr>
+          <w:noProof/>
+        </w:rPr>
+        <w:fldChar w:fldCharType="begin"/>
+      </w:r>
+      <w:r>
+        <w:rPr>
+          <w:noProof/>
+        </w:rPr>
+        <w:instrText xml:space="preserve"> PAGEREF _Toc243648545 \h </w:instrText>
       </w:r>
       <w:r>
         <w:rPr>
@@ -3034,7 +3150,7 @@
         <w:rPr>
           <w:noProof/>
         </w:rPr>
-        <w:instrText xml:space="preserve"> PAGEREF _Toc243648157 \h </w:instrText>
+        <w:instrText xml:space="preserve"> PAGEREF _Toc243648546 \h </w:instrText>
       </w:r>
       <w:r>
         <w:rPr>
@@ -3092,7 +3208,7 @@
         <w:rPr>
           <w:noProof/>
         </w:rPr>
-        <w:instrText xml:space="preserve"> PAGEREF _Toc243648158 \h </w:instrText>
+        <w:instrText xml:space="preserve"> PAGEREF _Toc243648547 \h </w:instrText>
       </w:r>
       <w:r>
         <w:rPr>
@@ -3150,7 +3266,7 @@
         <w:rPr>
           <w:noProof/>
         </w:rPr>
-        <w:instrText xml:space="preserve"> PAGEREF _Toc243648159 \h </w:instrText>
+        <w:instrText xml:space="preserve"> PAGEREF _Toc243648548 \h </w:instrText>
       </w:r>
       <w:r>
         <w:rPr>
@@ -3208,7 +3324,7 @@
         <w:rPr>
           <w:noProof/>
         </w:rPr>
-        <w:instrText xml:space="preserve"> PAGEREF _Toc243648160 \h </w:instrText>
+        <w:instrText xml:space="preserve"> PAGEREF _Toc243648549 \h </w:instrText>
       </w:r>
       <w:r>
         <w:rPr>
@@ -3266,7 +3382,7 @@
         <w:rPr>
           <w:noProof/>
         </w:rPr>
-        <w:instrText xml:space="preserve"> PAGEREF _Toc243648161 \h </w:instrText>
+        <w:instrText xml:space="preserve"> PAGEREF _Toc243648550 \h </w:instrText>
       </w:r>
       <w:r>
         <w:rPr>
@@ -3324,7 +3440,7 @@
         <w:rPr>
           <w:noProof/>
         </w:rPr>
-        <w:instrText xml:space="preserve"> PAGEREF _Toc243648162 \h </w:instrText>
+        <w:instrText xml:space="preserve"> PAGEREF _Toc243648551 \h </w:instrText>
       </w:r>
       <w:r>
         <w:rPr>
@@ -3382,7 +3498,7 @@
         <w:rPr>
           <w:noProof/>
         </w:rPr>
-        <w:instrText xml:space="preserve"> PAGEREF _Toc243648163 \h </w:instrText>
+        <w:instrText xml:space="preserve"> PAGEREF _Toc243648552 \h </w:instrText>
       </w:r>
       <w:r>
         <w:rPr>
@@ -3440,7 +3556,7 @@
         <w:rPr>
           <w:noProof/>
         </w:rPr>
-        <w:instrText xml:space="preserve"> PAGEREF _Toc243648164 \h </w:instrText>
+        <w:instrText xml:space="preserve"> PAGEREF _Toc243648553 \h </w:instrText>
       </w:r>
       <w:r>
         <w:rPr>
@@ -3498,7 +3614,7 @@
         <w:rPr>
           <w:noProof/>
         </w:rPr>
-        <w:instrText xml:space="preserve"> PAGEREF _Toc243648165 \h </w:instrText>
+        <w:instrText xml:space="preserve"> PAGEREF _Toc243648554 \h </w:instrText>
       </w:r>
       <w:r>
         <w:rPr>
@@ -3556,7 +3672,7 @@
         <w:rPr>
           <w:noProof/>
         </w:rPr>
-        <w:instrText xml:space="preserve"> PAGEREF _Toc243648166 \h </w:instrText>
+        <w:instrText xml:space="preserve"> PAGEREF _Toc243648555 \h </w:instrText>
       </w:r>
       <w:r>
         <w:rPr>
@@ -3614,7 +3730,7 @@
         <w:rPr>
           <w:noProof/>
         </w:rPr>
-        <w:instrText xml:space="preserve"> PAGEREF _Toc243648167 \h </w:instrText>
+        <w:instrText xml:space="preserve"> PAGEREF _Toc243648556 \h </w:instrText>
       </w:r>
       <w:r>
         <w:rPr>
@@ -3632,6 +3748,64 @@
           <w:noProof/>
         </w:rPr>
         <w:t>23</w:t>
+      </w:r>
+      <w:r>
+        <w:rPr>
+          <w:noProof/>
+        </w:rPr>
+        <w:fldChar w:fldCharType="end"/>
+      </w:r>
+    </w:p>
+    <w:p>
+      <w:pPr>
+        <w:pStyle w:val="TOC1"/>
+        <w:tabs>
+          <w:tab w:val="right" w:leader="dot" w:pos="9061"/>
+        </w:tabs>
+        <w:rPr>
+          <w:noProof/>
+        </w:rPr>
+      </w:pPr>
+      <w:r>
+        <w:rPr>
+          <w:noProof/>
+        </w:rPr>
+        <w:t>APPENDIX G: Experiment Interfaces (Parameter Variation and Monte Carlo)</w:t>
+      </w:r>
+      <w:r>
+        <w:rPr>
+          <w:noProof/>
+        </w:rPr>
+        <w:tab/>
+      </w:r>
+      <w:r>
+        <w:rPr>
+          <w:noProof/>
+        </w:rPr>
+        <w:fldChar w:fldCharType="begin"/>
+      </w:r>
+      <w:r>
+        <w:rPr>
+          <w:noProof/>
+        </w:rPr>
+        <w:instrText xml:space="preserve"> PAGEREF _Toc243648557 \h </w:instrText>
+      </w:r>
+      <w:r>
+        <w:rPr>
+          <w:noProof/>
+        </w:rPr>
+      </w:r>
+      <w:r>
+        <w:rPr>
+          <w:noProof/>
+        </w:rPr>
+        <w:fldChar w:fldCharType="separate"/>
+      </w:r>
+      <w:r>
+        <w:rPr>
+          <w:noProof/>
+        </w:rPr>
+        <w:t>24</w:t>
       </w:r>
       <w:r>
         <w:rPr>
@@ -3695,7 +3869,7 @@
       <w:pPr>
         <w:pStyle w:val="Heading1"/>
       </w:pPr>
-      <w:bookmarkStart w:id="0" w:name="_Toc243648110"/>
+      <w:bookmarkStart w:id="0" w:name="_Toc243648497"/>
       <w:r>
         <w:t>Introduction</w:t>
       </w:r>
@@ -3705,7 +3879,7 @@
       <w:pPr>
         <w:pStyle w:val="Heading2"/>
       </w:pPr>
-      <w:bookmarkStart w:id="1" w:name="_Toc243648111"/>
+      <w:bookmarkStart w:id="1" w:name="_Toc243648498"/>
       <w:r>
         <w:t>Context and Motivation</w:t>
       </w:r>
@@ -3715,7 +3889,7 @@
       <w:pPr>
         <w:pStyle w:val="Heading2"/>
       </w:pPr>
-      <w:bookmarkStart w:id="2" w:name="_Toc243648112"/>
+      <w:bookmarkStart w:id="2" w:name="_Toc243648499"/>
       <w:r>
         <w:t>Simulation's Objectives</w:t>
       </w:r>
@@ -3725,7 +3899,7 @@
       <w:pPr>
         <w:pStyle w:val="Heading2"/>
       </w:pPr>
-      <w:bookmarkStart w:id="3" w:name="_Toc243648113"/>
+      <w:bookmarkStart w:id="3" w:name="_Toc243648500"/>
       <w:r>
         <w:t>Report Structure</w:t>
       </w:r>
@@ -3735,7 +3909,7 @@
       <w:pPr>
         <w:pStyle w:val="Heading1"/>
       </w:pPr>
-      <w:bookmarkStart w:id="4" w:name="_Toc243648114"/>
+      <w:bookmarkStart w:id="4" w:name="_Toc243648501"/>
       <w:r>
         <w:t>Problem Description</w:t>
       </w:r>
@@ -3745,7 +3919,7 @@
       <w:pPr>
         <w:pStyle w:val="Heading2"/>
       </w:pPr>
-      <w:bookmarkStart w:id="5" w:name="_Toc243648115"/>
+      <w:bookmarkStart w:id="5" w:name="_Toc243648502"/>
       <w:r>
         <w:t>Euronext Lisbon and the PSI</w:t>
       </w:r>
@@ -3755,7 +3929,7 @@
       <w:pPr>
         <w:pStyle w:val="Heading2"/>
       </w:pPr>
-      <w:bookmarkStart w:id="6" w:name="_Toc243648116"/>
+      <w:bookmarkStart w:id="6" w:name="_Toc243648503"/>
       <w:r>
         <w:t>How a Market Fall Propagates</w:t>
       </w:r>
@@ -3765,7 +3939,7 @@
       <w:pPr>
         <w:pStyle w:val="Heading2"/>
       </w:pPr>
-      <w:bookmarkStart w:id="7" w:name="_Toc243648117"/>
+      <w:bookmarkStart w:id="7" w:name="_Toc243648504"/>
       <w:r>
         <w:t>Volatility Interruptions at Euronext</w:t>
       </w:r>
@@ -3775,7 +3949,7 @@
       <w:pPr>
         <w:pStyle w:val="Heading2"/>
       </w:pPr>
-      <w:bookmarkStart w:id="8" w:name="_Toc243648118"/>
+      <w:bookmarkStart w:id="8" w:name="_Toc243648505"/>
       <w:r>
         <w:t>Problem Statement and Research Questions</w:t>
       </w:r>
@@ -3785,7 +3959,7 @@
       <w:pPr>
         <w:pStyle w:val="Heading1"/>
       </w:pPr>
-      <w:bookmarkStart w:id="9" w:name="_Toc243648119"/>
+      <w:bookmarkStart w:id="9" w:name="_Toc243648506"/>
       <w:r>
         <w:t>Data and Stylised Facts</w:t>
       </w:r>
@@ -3795,7 +3969,7 @@
       <w:pPr>
         <w:pStyle w:val="Heading2"/>
       </w:pPr>
-      <w:bookmarkStart w:id="10" w:name="_Toc243648120"/>
+      <w:bookmarkStart w:id="10" w:name="_Toc243648507"/>
       <w:r>
         <w:t>Data Sources</w:t>
       </w:r>
@@ -3805,7 +3979,7 @@
       <w:pPr>
         <w:pStyle w:val="Heading2"/>
       </w:pPr>
-      <w:bookmarkStart w:id="11" w:name="_Toc243648121"/>
+      <w:bookmarkStart w:id="11" w:name="_Toc243648508"/>
       <w:r>
         <w:t>Stylised Facts of the BCP Stock</w:t>
       </w:r>
@@ -3815,7 +3989,7 @@
       <w:pPr>
         <w:pStyle w:val="Heading2"/>
       </w:pPr>
-      <w:bookmarkStart w:id="12" w:name="_Toc243648122"/>
+      <w:bookmarkStart w:id="12" w:name="_Toc243648509"/>
       <w:r>
         <w:t>Key Assumptions</w:t>
       </w:r>
@@ -3825,7 +3999,7 @@
       <w:pPr>
         <w:pStyle w:val="Heading1"/>
       </w:pPr>
-      <w:bookmarkStart w:id="13" w:name="_Toc243648123"/>
+      <w:bookmarkStart w:id="13" w:name="_Toc243648510"/>
       <w:r>
         <w:t>System Modelling</w:t>
       </w:r>
@@ -3835,7 +4009,7 @@
       <w:pPr>
         <w:pStyle w:val="Heading2"/>
       </w:pPr>
-      <w:bookmarkStart w:id="14" w:name="_Toc243648124"/>
+      <w:bookmarkStart w:id="14" w:name="_Toc243648511"/>
       <w:r>
         <w:t>Modelling Approach</w:t>
       </w:r>
@@ -3845,7 +4019,7 @@
       <w:pPr>
         <w:pStyle w:val="Heading2"/>
       </w:pPr>
-      <w:bookmarkStart w:id="15" w:name="_Toc243648125"/>
+      <w:bookmarkStart w:id="15" w:name="_Toc243648512"/>
       <w:r>
         <w:t>Implementation</w:t>
       </w:r>
@@ -3855,7 +4029,7 @@
       <w:pPr>
         <w:pStyle w:val="Heading3"/>
       </w:pPr>
-      <w:bookmarkStart w:id="16" w:name="_Toc243648126"/>
+      <w:bookmarkStart w:id="16" w:name="_Toc243648513"/>
       <w:r>
         <w:t>Main agent</w:t>
       </w:r>
@@ -3865,7 +4039,7 @@
       <w:pPr>
         <w:pStyle w:val="Heading3"/>
       </w:pPr>
-      <w:bookmarkStart w:id="17" w:name="_Toc243648127"/>
+      <w:bookmarkStart w:id="17" w:name="_Toc243648514"/>
       <w:r>
         <w:t>Order Book (Stock agent type)</w:t>
       </w:r>
@@ -3875,7 +4049,7 @@
       <w:pPr>
         <w:pStyle w:val="Heading3"/>
       </w:pPr>
-      <w:bookmarkStart w:id="18" w:name="_Toc243648128"/>
+      <w:bookmarkStart w:id="18" w:name="_Toc243648515"/>
       <w:r>
         <w:t>Volatility Interruptions and Reopening Auction</w:t>
       </w:r>
@@ -3885,7 +4059,7 @@
       <w:pPr>
         <w:pStyle w:val="Heading3"/>
       </w:pPr>
-      <w:bookmarkStart w:id="19" w:name="_Toc243648129"/>
+      <w:bookmarkStart w:id="19" w:name="_Toc243648516"/>
       <w:r>
         <w:t>Fundamentalist agent type</w:t>
       </w:r>
@@ -3895,7 +4069,7 @@
       <w:pPr>
         <w:pStyle w:val="Heading3"/>
       </w:pPr>
-      <w:bookmarkStart w:id="20" w:name="_Toc243648130"/>
+      <w:bookmarkStart w:id="20" w:name="_Toc243648517"/>
       <w:r>
         <w:t>Trend Follower agent type and Herding</w:t>
       </w:r>
@@ -3905,7 +4079,7 @@
       <w:pPr>
         <w:pStyle w:val="Heading3"/>
       </w:pPr>
-      <w:bookmarkStart w:id="21" w:name="_Toc243648131"/>
+      <w:bookmarkStart w:id="21" w:name="_Toc243648518"/>
       <w:r>
         <w:t>Noise Trader agent type</w:t>
       </w:r>
@@ -3915,7 +4089,7 @@
       <w:pPr>
         <w:pStyle w:val="Heading3"/>
       </w:pPr>
-      <w:bookmarkStart w:id="22" w:name="_Toc243648132"/>
+      <w:bookmarkStart w:id="22" w:name="_Toc243648519"/>
       <w:r>
         <w:t>Market Maker agent type</w:t>
       </w:r>
@@ -3925,7 +4099,7 @@
       <w:pPr>
         <w:pStyle w:val="Heading3"/>
       </w:pPr>
-      <w:bookmarkStart w:id="23" w:name="_Toc243648133"/>
+      <w:bookmarkStart w:id="23" w:name="_Toc243648520"/>
       <w:r>
         <w:t>News agent type</w:t>
       </w:r>
@@ -3935,7 +4109,7 @@
       <w:pPr>
         <w:pStyle w:val="Heading1"/>
       </w:pPr>
-      <w:bookmarkStart w:id="24" w:name="_Toc243648134"/>
+      <w:bookmarkStart w:id="24" w:name="_Toc243648521"/>
       <w:r>
         <w:t>Simulation Interface and User Controls</w:t>
       </w:r>
@@ -3945,7 +4119,7 @@
       <w:pPr>
         <w:pStyle w:val="Heading2"/>
       </w:pPr>
-      <w:bookmarkStart w:id="25" w:name="_Toc243648135"/>
+      <w:bookmarkStart w:id="25" w:name="_Toc243648522"/>
       <w:r>
         <w:t>Initial Setup Page</w:t>
       </w:r>
@@ -3955,7 +4129,7 @@
       <w:pPr>
         <w:pStyle w:val="Heading2"/>
       </w:pPr>
-      <w:bookmarkStart w:id="26" w:name="_Toc243648136"/>
+      <w:bookmarkStart w:id="26" w:name="_Toc243648523"/>
       <w:r>
         <w:t>Dashboard</w:t>
       </w:r>
@@ -3965,7 +4139,7 @@
       <w:pPr>
         <w:pStyle w:val="Heading2"/>
       </w:pPr>
-      <w:bookmarkStart w:id="27" w:name="_Toc243648137"/>
+      <w:bookmarkStart w:id="27" w:name="_Toc243648524"/>
       <w:r>
         <w:t>Data Export</w:t>
       </w:r>
@@ -3975,7 +4149,7 @@
       <w:pPr>
         <w:pStyle w:val="Heading1"/>
       </w:pPr>
-      <w:bookmarkStart w:id="28" w:name="_Toc243648138"/>
+      <w:bookmarkStart w:id="28" w:name="_Toc243648525"/>
       <w:r>
         <w:t>Verification, Calibration and Validation</w:t>
       </w:r>
@@ -3985,7 +4159,7 @@
       <w:pPr>
         <w:pStyle w:val="Heading2"/>
       </w:pPr>
-      <w:bookmarkStart w:id="29" w:name="_Toc243648139"/>
+      <w:bookmarkStart w:id="29" w:name="_Toc243648526"/>
       <w:r>
         <w:t>Order Book Tests</w:t>
       </w:r>
@@ -3995,7 +4169,7 @@
       <w:pPr>
         <w:pStyle w:val="Heading2"/>
       </w:pPr>
-      <w:bookmarkStart w:id="30" w:name="_Toc243648140"/>
+      <w:bookmarkStart w:id="30" w:name="_Toc243648527"/>
       <w:r>
         <w:t>Extreme Condition Tests</w:t>
       </w:r>
@@ -4005,7 +4179,7 @@
       <w:pPr>
         <w:pStyle w:val="Heading2"/>
       </w:pPr>
-      <w:bookmarkStart w:id="31" w:name="_Toc243648141"/>
+      <w:bookmarkStart w:id="31" w:name="_Toc243648528"/>
       <w:r>
         <w:t>Calibration</w:t>
       </w:r>
@@ -4015,7 +4189,7 @@
       <w:pPr>
         <w:pStyle w:val="Heading2"/>
       </w:pPr>
-      <w:bookmarkStart w:id="32" w:name="_Toc243648142"/>
+      <w:bookmarkStart w:id="32" w:name="_Toc243648529"/>
       <w:r>
         <w:t>Validation</w:t>
       </w:r>
@@ -4025,7 +4199,7 @@
       <w:pPr>
         <w:pStyle w:val="Heading1"/>
       </w:pPr>
-      <w:bookmarkStart w:id="33" w:name="_Toc243648143"/>
+      <w:bookmarkStart w:id="33" w:name="_Toc243648530"/>
       <w:r>
         <w:t>Experiments and Simulation Scenarios</w:t>
       </w:r>
@@ -4035,7 +4209,7 @@
       <w:pPr>
         <w:pStyle w:val="Heading2"/>
       </w:pPr>
-      <w:bookmarkStart w:id="34" w:name="_Toc243648144"/>
+      <w:bookmarkStart w:id="34" w:name="_Toc243648531"/>
       <w:r>
         <w:t>Baseline Scenario</w:t>
       </w:r>
@@ -4045,7 +4219,7 @@
       <w:pPr>
         <w:pStyle w:val="Heading2"/>
       </w:pPr>
-      <w:bookmarkStart w:id="35" w:name="_Toc243648145"/>
+      <w:bookmarkStart w:id="35" w:name="_Toc243648532"/>
       <w:r>
         <w:t>Large Shock with and without Collars</w:t>
       </w:r>
@@ -4055,7 +4229,7 @@
       <w:pPr>
         <w:pStyle w:val="Heading2"/>
       </w:pPr>
-      <w:bookmarkStart w:id="36" w:name="_Toc243648146"/>
+      <w:bookmarkStart w:id="36" w:name="_Toc243648533"/>
       <w:r>
         <w:t>Shock with a High Share of Trend Followers</w:t>
       </w:r>
@@ -4065,7 +4239,7 @@
       <w:pPr>
         <w:pStyle w:val="Heading2"/>
       </w:pPr>
-      <w:bookmarkStart w:id="37" w:name="_Toc243648147"/>
+      <w:bookmarkStart w:id="37" w:name="_Toc243648534"/>
       <w:r>
         <w:t>Collar Thresholds and Reservation Duration</w:t>
       </w:r>
@@ -4075,7 +4249,7 @@
       <w:pPr>
         <w:pStyle w:val="Heading2"/>
       </w:pPr>
-      <w:bookmarkStart w:id="38" w:name="_Toc243648148"/>
+      <w:bookmarkStart w:id="38" w:name="_Toc243648535"/>
       <w:r>
         <w:t>Optimal Thresholds</w:t>
       </w:r>
@@ -4085,7 +4259,7 @@
       <w:pPr>
         <w:pStyle w:val="Heading2"/>
       </w:pPr>
-      <w:bookmarkStart w:id="39" w:name="_Toc243648149"/>
+      <w:bookmarkStart w:id="39" w:name="_Toc243648536"/>
       <w:r>
         <w:t>Sensitivity Analysis</w:t>
       </w:r>
@@ -4093,113 +4267,133 @@
     </w:p>
     <w:p>
       <w:pPr>
+        <w:pStyle w:val="Heading2"/>
+      </w:pPr>
+      <w:bookmarkStart w:id="40" w:name="_Toc243648537"/>
+      <w:r>
+        <w:t>Monte Carlo Replications</w:t>
+      </w:r>
+      <w:bookmarkEnd w:id="40"/>
+    </w:p>
+    <w:p>
+      <w:pPr>
         <w:pStyle w:val="Heading1"/>
       </w:pPr>
-      <w:bookmarkStart w:id="40" w:name="_Toc243648150"/>
+      <w:bookmarkStart w:id="41" w:name="_Toc243648538"/>
       <w:r>
         <w:t>Results</w:t>
       </w:r>
-      <w:bookmarkEnd w:id="40"/>
+      <w:bookmarkEnd w:id="41"/>
     </w:p>
     <w:p>
       <w:pPr>
         <w:pStyle w:val="Heading2"/>
       </w:pPr>
-      <w:bookmarkStart w:id="41" w:name="_Toc243648151"/>
+      <w:bookmarkStart w:id="42" w:name="_Toc243648539"/>
       <w:r>
         <w:t>Baseline Scenario</w:t>
       </w:r>
-      <w:bookmarkEnd w:id="41"/>
+      <w:bookmarkEnd w:id="42"/>
     </w:p>
     <w:p>
       <w:pPr>
         <w:pStyle w:val="Heading2"/>
       </w:pPr>
-      <w:bookmarkStart w:id="42" w:name="_Toc243648152"/>
+      <w:bookmarkStart w:id="43" w:name="_Toc243648540"/>
       <w:r>
         <w:t>Large Shock with and without Collars</w:t>
       </w:r>
-      <w:bookmarkEnd w:id="42"/>
+      <w:bookmarkEnd w:id="43"/>
     </w:p>
     <w:p>
       <w:pPr>
         <w:pStyle w:val="Heading2"/>
       </w:pPr>
-      <w:bookmarkStart w:id="43" w:name="_Toc243648153"/>
+      <w:bookmarkStart w:id="44" w:name="_Toc243648541"/>
       <w:r>
         <w:t>Shock with a High Share of Trend Followers</w:t>
       </w:r>
-      <w:bookmarkEnd w:id="43"/>
+      <w:bookmarkEnd w:id="44"/>
     </w:p>
     <w:p>
       <w:pPr>
         <w:pStyle w:val="Heading2"/>
       </w:pPr>
-      <w:bookmarkStart w:id="44" w:name="_Toc243648154"/>
+      <w:bookmarkStart w:id="45" w:name="_Toc243648542"/>
       <w:r>
         <w:t>Collar Thresholds and Reservation Duration</w:t>
       </w:r>
-      <w:bookmarkEnd w:id="44"/>
+      <w:bookmarkEnd w:id="45"/>
     </w:p>
     <w:p>
       <w:pPr>
         <w:pStyle w:val="Heading2"/>
       </w:pPr>
-      <w:bookmarkStart w:id="45" w:name="_Toc243648155"/>
+      <w:bookmarkStart w:id="46" w:name="_Toc243648543"/>
       <w:r>
         <w:t>Optimal Thresholds</w:t>
       </w:r>
-      <w:bookmarkEnd w:id="45"/>
+      <w:bookmarkEnd w:id="46"/>
     </w:p>
     <w:p>
       <w:pPr>
         <w:pStyle w:val="Heading2"/>
       </w:pPr>
-      <w:bookmarkStart w:id="46" w:name="_Toc243648156"/>
+      <w:bookmarkStart w:id="47" w:name="_Toc243648544"/>
       <w:r>
         <w:t>Sensitivity Analysis</w:t>
       </w:r>
-      <w:bookmarkEnd w:id="46"/>
+      <w:bookmarkEnd w:id="47"/>
+    </w:p>
+    <w:p>
+      <w:pPr>
+        <w:pStyle w:val="Heading2"/>
+      </w:pPr>
+      <w:bookmarkStart w:id="48" w:name="_Toc243648545"/>
+      <w:r>
+        <w:t>Monte Carlo Replications</w:t>
+      </w:r>
+      <w:bookmarkEnd w:id="48"/>
     </w:p>
     <w:p>
       <w:pPr>
         <w:pStyle w:val="Heading1"/>
       </w:pPr>
-      <w:bookmarkStart w:id="47" w:name="_Toc243648157"/>
+      <w:bookmarkStart w:id="49" w:name="_Toc243648546"/>
       <w:r>
         <w:t>Discussion and Interpretation of Results</w:t>
       </w:r>
-      <w:bookmarkEnd w:id="47"/>
+      <w:bookmarkEnd w:id="49"/>
     </w:p>
     <w:p>
       <w:pPr>
         <w:pStyle w:val="Heading1"/>
       </w:pPr>
-      <w:bookmarkStart w:id="48" w:name="_Toc243648158"/>
+      <w:bookmarkStart w:id="50" w:name="_Toc243648547"/>
       <w:r>
         <w:t>Conclusions</w:t>
       </w:r>
-      <w:bookmarkEnd w:id="48"/>
+      <w:bookmarkEnd w:id="50"/>
     </w:p>
     <w:p>
       <w:pPr>
         <w:pStyle w:val="Heading2"/>
       </w:pPr>
-      <w:bookmarkStart w:id="49" w:name="_Toc243648159"/>
+      <w:bookmarkStart w:id="51" w:name="_Toc243648548"/>
       <w:r>
         <w:t>Final Considerations</w:t>
       </w:r>
-      <w:bookmarkEnd w:id="49"/>
+      <w:bookmarkEnd w:id="51"/>
     </w:p>
     <w:p>
       <w:pPr>
         <w:pStyle w:val="Heading2"/>
       </w:pPr>
-      <w:bookmarkStart w:id="50" w:name="_Toc243648160"/>
+      <w:bookmarkStart w:id="52" w:name="_Toc243648549"/>
       <w:r>
         <w:t>Limitations and Future Work</w:t>
       </w:r>
-      <w:bookmarkEnd w:id="50"/>
+      <w:bookmarkEnd w:id="52"/>
     </w:p>
     <w:p>
       <w:pPr>
@@ -4209,11 +4403,11 @@
           <w:numId w:val="0"/>
         </w:numPr>
       </w:pPr>
-      <w:bookmarkStart w:id="51" w:name="_Toc243648161"/>
+      <w:bookmarkStart w:id="53" w:name="_Toc243648550"/>
       <w:r>
         <w:t>References</w:t>
       </w:r>
-      <w:bookmarkEnd w:id="51"/>
+      <w:bookmarkEnd w:id="53"/>
     </w:p>
     <w:p>
       <w:pPr>
@@ -4223,11 +4417,11 @@
           <w:numId w:val="0"/>
         </w:numPr>
       </w:pPr>
-      <w:bookmarkStart w:id="52" w:name="_Toc243648162"/>
+      <w:bookmarkStart w:id="54" w:name="_Toc243648551"/>
       <w:r>
         <w:t>APPENDIX A: Model Parameters and Initial Configuration</w:t>
       </w:r>
-      <w:bookmarkEnd w:id="52"/>
+      <w:bookmarkEnd w:id="54"/>
     </w:p>
     <w:p>
       <w:pPr>
@@ -4237,11 +4431,11 @@
           <w:numId w:val="0"/>
         </w:numPr>
       </w:pPr>
-      <w:bookmarkStart w:id="53" w:name="_Toc243648163"/>
+      <w:bookmarkStart w:id="55" w:name="_Toc243648552"/>
       <w:r>
         <w:t>APPENDIX B: Simulation Dashboard</w:t>
       </w:r>
-      <w:bookmarkEnd w:id="53"/>
+      <w:bookmarkEnd w:id="55"/>
     </w:p>
     <w:p>
       <w:pPr>
@@ -4251,11 +4445,11 @@
           <w:numId w:val="0"/>
         </w:numPr>
       </w:pPr>
-      <w:bookmarkStart w:id="54" w:name="_Toc243648164"/>
+      <w:bookmarkStart w:id="56" w:name="_Toc243648553"/>
       <w:r>
         <w:t>APPENDIX C: Order Book Test Output</w:t>
       </w:r>
-      <w:bookmarkEnd w:id="54"/>
+      <w:bookmarkEnd w:id="56"/>
     </w:p>
     <w:p>
       <w:pPr>
@@ -4265,11 +4459,11 @@
           <w:numId w:val="0"/>
         </w:numPr>
       </w:pPr>
-      <w:bookmarkStart w:id="55" w:name="_Toc243648165"/>
+      <w:bookmarkStart w:id="57" w:name="_Toc243648554"/>
       <w:r>
         <w:t>APPENDIX D: Calibration Log</w:t>
       </w:r>
-      <w:bookmarkEnd w:id="55"/>
+      <w:bookmarkEnd w:id="57"/>
     </w:p>
     <w:p>
       <w:pPr>
@@ -4279,11 +4473,11 @@
           <w:numId w:val="0"/>
         </w:numPr>
       </w:pPr>
-      <w:bookmarkStart w:id="56" w:name="_Toc243648166"/>
+      <w:bookmarkStart w:id="58" w:name="_Toc243648555"/>
       <w:r>
         <w:t>APPENDIX E: Assumptions Register</w:t>
       </w:r>
-      <w:bookmarkEnd w:id="56"/>
+      <w:bookmarkEnd w:id="58"/>
     </w:p>
     <w:p>
       <w:pPr>
@@ -4293,11 +4487,25 @@
           <w:numId w:val="0"/>
         </w:numPr>
       </w:pPr>
-      <w:bookmarkStart w:id="57" w:name="_Toc243648167"/>
+      <w:bookmarkStart w:id="59" w:name="_Toc243648556"/>
       <w:r>
         <w:t>APPENDIX F: Results Excel File</w:t>
       </w:r>
-      <w:bookmarkEnd w:id="57"/>
+      <w:bookmarkEnd w:id="59"/>
+    </w:p>
+    <w:p>
+      <w:pPr>
+        <w:pStyle w:val="Heading1"/>
+        <w:numPr>
+          <w:ilvl w:val="0"/>
+          <w:numId w:val="0"/>
+        </w:numPr>
+      </w:pPr>
+      <w:bookmarkStart w:id="60" w:name="_Toc243648557"/>
+      <w:r>
+        <w:t>APPENDIX G: Experiment Interfaces (Parameter Variation and Monte Carlo)</w:t>
+      </w:r>
+      <w:bookmarkEnd w:id="60"/>
     </w:p>
     <w:p/>
     <w:sectPr>
@@ -4503,9 +4711,9 @@
 <file path=word/numbering.xml><?xml version="1.0" encoding="utf-8"?>
 <w:numbering xmlns:wpc="http://schemas.microsoft.com/office/word/2010/wordprocessingCanvas" xmlns:cx="http://schemas.microsoft.com/office/drawing/2014/chartex" xmlns:cx1="http://schemas.microsoft.com/office/drawing/2015/9/8/chartex" xmlns:cx2="http://schemas.microsoft.com/office/drawing/2015/10/21/chartex" xmlns:cx3="http://schemas.microsoft.com/office/drawing/2016/5/9/chartex" xmlns:cx4="http://schemas.microsoft.com/office/drawing/2016/5/10/chartex" xmlns:cx5="http://schemas.microsoft.com/office/drawing/2016/5/11/chartex" xmlns:cx6="http://schemas.microsoft.com/office/drawing/2016/5/12/chartex" xmlns:cx7="http://schemas.microsoft.com/office/drawing/2016/5/13/chartex" xmlns:cx8="http://schemas.microsoft.com/office/drawing/2016/5/14/chartex" xmlns:mc="http://schemas.openxmlformats.org/markup-compatibility/2006" xmlns:aink="http://schemas.microsoft.com/office/drawing/2016/ink" xmlns:am3d="http://schemas.microsoft.com/office/drawing/2017/model3d" xmlns:o="urn:schemas-microsoft-com:office:office" xmlns:oel="http://schemas.microsoft.com/office/2019/extlst" xmlns:r="http://schemas.openxmlformats.org/officeDocument/2006/relationships" xmlns:m="http://schemas.openxmlformats.org/officeDocument/2006/math" xmlns:v="urn:schemas-microsoft-com:vml" xmlns:wp14="http://schemas.microsoft.com/office/word/2010/wordprocessingDrawing" xmlns:wp="http://schemas.openxmlformats.org/drawingml/2006/wordprocessingDrawing" xmlns:w10="urn:schemas-microsoft-com:office:word" xmlns:w="http://schemas.openxmlformats.org/wordprocessingml/2006/main" xmlns:w14="http://schemas.microsoft.com/office/word/2010/wordml" xmlns:w15="http://schemas.microsoft.com/office/word/2012/wordml" xmlns:w16cex="http://schemas.microsoft.com/office/word/2018/wordml/cex" xmlns:w16cid="http://schemas.microsoft.com/office/word/2016/wordml/cid" xmlns:w16="http://schemas.microsoft.com/office/word/2018/wordml" xmlns:w16du="http://schemas.microsoft.com/office/word/2023/wordml/word16du" xmlns:w16sdtdh="http://schemas.microsoft.com/office/word/2020/wordml/sdtdatahash" xmlns:w16sdtfl="http://schemas.microsoft.com/office/word/2024/wordml/sdtformatlock" xmlns:w16se="http://schemas.microsoft.com/office/word/2015/wordml/symex" xmlns:wpg="http://schemas.microsoft.com/office/word/2010/wordprocessingGroup" xmlns:wpi="http://schemas.microsoft.com/office/word/2010/wordprocessingInk" xmlns:wne="http://schemas.microsoft.com/office/word/2006/wordml" xmlns:wps="http://schemas.microsoft.com/office/word/2010/wordprocessingShape" mc:Ignorable="w14 w15 w16se w16cid w16 w16cex w16sdtdh w16sdtfl w16du wp14">
   <w:abstractNum w:abstractNumId="0" w15:restartNumberingAfterBreak="0">
-    <w:nsid w:val="7E1076E9"/>
+    <w:nsid w:val="2F522794"/>
     <w:multiLevelType w:val="multilevel"/>
-    <w:tmpl w:val="BB286F42"/>
+    <w:tmpl w:val="9C804FDE"/>
     <w:lvl w:ilvl="0">
       <w:start w:val="1"/>
       <w:numFmt w:val="decimal"/>
@@ -4595,7 +4803,7 @@
       </w:pPr>
     </w:lvl>
   </w:abstractNum>
-  <w:num w:numId="1" w16cid:durableId="376323519">
+  <w:num w:numId="1" w16cid:durableId="967204897">
     <w:abstractNumId w:val="0"/>
   </w:num>
 </w:numbering>
@@ -5016,7 +5224,7 @@
     <w:link w:val="Heading1Char"/>
     <w:uiPriority w:val="9"/>
     <w:qFormat/>
-    <w:rsid w:val="0026198B"/>
+    <w:rsid w:val="00137804"/>
     <w:pPr>
       <w:keepNext/>
       <w:keepLines/>
@@ -5043,7 +5251,7 @@
     <w:uiPriority w:val="9"/>
     <w:unhideWhenUsed/>
     <w:qFormat/>
-    <w:rsid w:val="0026198B"/>
+    <w:rsid w:val="00137804"/>
     <w:pPr>
       <w:keepNext/>
       <w:keepLines/>
@@ -5070,7 +5278,7 @@
     <w:uiPriority w:val="9"/>
     <w:unhideWhenUsed/>
     <w:qFormat/>
-    <w:rsid w:val="0026198B"/>
+    <w:rsid w:val="00137804"/>
     <w:pPr>
       <w:keepNext/>
       <w:keepLines/>
@@ -5098,7 +5306,7 @@
     <w:semiHidden/>
     <w:unhideWhenUsed/>
     <w:qFormat/>
-    <w:rsid w:val="0026198B"/>
+    <w:rsid w:val="00137804"/>
     <w:pPr>
       <w:keepNext/>
       <w:keepLines/>
@@ -5121,7 +5329,7 @@
     <w:semiHidden/>
     <w:unhideWhenUsed/>
     <w:qFormat/>
-    <w:rsid w:val="0026198B"/>
+    <w:rsid w:val="00137804"/>
     <w:pPr>
       <w:keepNext/>
       <w:keepLines/>
@@ -5142,7 +5350,7 @@
     <w:semiHidden/>
     <w:unhideWhenUsed/>
     <w:qFormat/>
-    <w:rsid w:val="0026198B"/>
+    <w:rsid w:val="00137804"/>
     <w:pPr>
       <w:keepNext/>
       <w:keepLines/>
@@ -5165,7 +5373,7 @@
     <w:semiHidden/>
     <w:unhideWhenUsed/>
     <w:qFormat/>
-    <w:rsid w:val="0026198B"/>
+    <w:rsid w:val="00137804"/>
     <w:pPr>
       <w:keepNext/>
       <w:keepLines/>
@@ -5186,7 +5394,7 @@
     <w:semiHidden/>
     <w:unhideWhenUsed/>
     <w:qFormat/>
-    <w:rsid w:val="0026198B"/>
+    <w:rsid w:val="00137804"/>
     <w:pPr>
       <w:keepNext/>
       <w:keepLines/>
@@ -5209,7 +5417,7 @@
     <w:semiHidden/>
     <w:unhideWhenUsed/>
     <w:qFormat/>
-    <w:rsid w:val="0026198B"/>
+    <w:rsid w:val="00137804"/>
     <w:pPr>
       <w:keepNext/>
       <w:keepLines/>
@@ -5253,7 +5461,7 @@
     <w:basedOn w:val="DefaultParagraphFont"/>
     <w:link w:val="Heading1"/>
     <w:uiPriority w:val="9"/>
-    <w:rsid w:val="0026198B"/>
+    <w:rsid w:val="00137804"/>
     <w:rPr>
       <w:rFonts w:ascii="Trebuchet MS" w:eastAsiaTheme="majorEastAsia" w:hAnsi="Trebuchet MS" w:cstheme="majorBidi"/>
       <w:b/>
@@ -5267,7 +5475,7 @@
     <w:basedOn w:val="DefaultParagraphFont"/>
     <w:link w:val="Heading2"/>
     <w:uiPriority w:val="9"/>
-    <w:rsid w:val="0026198B"/>
+    <w:rsid w:val="00137804"/>
     <w:rPr>
       <w:rFonts w:ascii="Trebuchet MS" w:eastAsiaTheme="majorEastAsia" w:hAnsi="Trebuchet MS" w:cstheme="majorBidi"/>
       <w:b/>
@@ -5281,7 +5489,7 @@
     <w:basedOn w:val="DefaultParagraphFont"/>
     <w:link w:val="Heading3"/>
     <w:uiPriority w:val="9"/>
-    <w:rsid w:val="0026198B"/>
+    <w:rsid w:val="00137804"/>
     <w:rPr>
       <w:rFonts w:ascii="Trebuchet MS" w:eastAsiaTheme="majorEastAsia" w:hAnsi="Trebuchet MS" w:cstheme="majorBidi"/>
       <w:b/>
@@ -5296,7 +5504,7 @@
     <w:link w:val="Heading4"/>
     <w:uiPriority w:val="9"/>
     <w:semiHidden/>
-    <w:rsid w:val="0026198B"/>
+    <w:rsid w:val="00137804"/>
     <w:rPr>
       <w:rFonts w:eastAsiaTheme="majorEastAsia" w:cstheme="majorBidi"/>
       <w:i/>
@@ -5310,7 +5518,7 @@
     <w:link w:val="Heading5"/>
     <w:uiPriority w:val="9"/>
     <w:semiHidden/>
-    <w:rsid w:val="0026198B"/>
+    <w:rsid w:val="00137804"/>
     <w:rPr>
       <w:rFonts w:eastAsiaTheme="majorEastAsia" w:cstheme="majorBidi"/>
       <w:color w:val="0F4761" w:themeColor="accent1" w:themeShade="BF"/>
@@ -5322,7 +5530,7 @@
     <w:link w:val="Heading6"/>
     <w:uiPriority w:val="9"/>
     <w:semiHidden/>
-    <w:rsid w:val="0026198B"/>
+    <w:rsid w:val="00137804"/>
     <w:rPr>
       <w:rFonts w:eastAsiaTheme="majorEastAsia" w:cstheme="majorBidi"/>
       <w:i/>
@@ -5336,7 +5544,7 @@
     <w:link w:val="Heading7"/>
     <w:uiPriority w:val="9"/>
     <w:semiHidden/>
-    <w:rsid w:val="0026198B"/>
+    <w:rsid w:val="00137804"/>
     <w:rPr>
       <w:rFonts w:eastAsiaTheme="majorEastAsia" w:cstheme="majorBidi"/>
       <w:color w:val="595959" w:themeColor="text1" w:themeTint="A6"/>
@@ -5348,7 +5556,7 @@
     <w:link w:val="Heading8"/>
     <w:uiPriority w:val="9"/>
     <w:semiHidden/>
-    <w:rsid w:val="0026198B"/>
+    <w:rsid w:val="00137804"/>
     <w:rPr>
       <w:rFonts w:eastAsiaTheme="majorEastAsia" w:cstheme="majorBidi"/>
       <w:i/>
@@ -5362,7 +5570,7 @@
     <w:link w:val="Heading9"/>
     <w:uiPriority w:val="9"/>
     <w:semiHidden/>
-    <w:rsid w:val="0026198B"/>
+    <w:rsid w:val="00137804"/>
     <w:rPr>
       <w:rFonts w:eastAsiaTheme="majorEastAsia" w:cstheme="majorBidi"/>
       <w:color w:val="272727" w:themeColor="text1" w:themeTint="D8"/>
@@ -5375,7 +5583,7 @@
     <w:link w:val="TitleChar"/>
     <w:uiPriority w:val="10"/>
     <w:qFormat/>
-    <w:rsid w:val="0026198B"/>
+    <w:rsid w:val="00137804"/>
     <w:pPr>
       <w:spacing w:after="80" w:line="240" w:lineRule="auto"/>
       <w:contextualSpacing/>
@@ -5393,7 +5601,7 @@
     <w:basedOn w:val="DefaultParagraphFont"/>
     <w:link w:val="Title"/>
     <w:uiPriority w:val="10"/>
-    <w:rsid w:val="0026198B"/>
+    <w:rsid w:val="00137804"/>
     <w:rPr>
       <w:rFonts w:asciiTheme="majorHAnsi" w:eastAsiaTheme="majorEastAsia" w:hAnsiTheme="majorHAnsi" w:cstheme="majorBidi"/>
       <w:spacing w:val="-10"/>
@@ -5409,7 +5617,7 @@
     <w:link w:val="SubtitleChar"/>
     <w:uiPriority w:val="11"/>
     <w:qFormat/>
-    <w:rsid w:val="0026198B"/>
+    <w:rsid w:val="00137804"/>
     <w:pPr>
       <w:numPr>
         <w:ilvl w:val="1"/>
@@ -5428,7 +5636,7 @@
     <w:basedOn w:val="DefaultParagraphFont"/>
     <w:link w:val="Subtitle"/>
     <w:uiPriority w:val="11"/>
-    <w:rsid w:val="0026198B"/>
+    <w:rsid w:val="00137804"/>
     <w:rPr>
       <w:rFonts w:eastAsiaTheme="majorEastAsia" w:cstheme="majorBidi"/>
       <w:color w:val="595959" w:themeColor="text1" w:themeTint="A6"/>
@@ -5444,7 +5652,7 @@
     <w:link w:val="QuoteChar"/>
     <w:uiPriority w:val="29"/>
     <w:qFormat/>
-    <w:rsid w:val="0026198B"/>
+    <w:rsid w:val="00137804"/>
     <w:pPr>
       <w:spacing w:before="160"/>
       <w:jc w:val="center"/>
@@ -5460,7 +5668,7 @@
     <w:basedOn w:val="DefaultParagraphFont"/>
     <w:link w:val="Quote"/>
     <w:uiPriority w:val="29"/>
-    <w:rsid w:val="0026198B"/>
+    <w:rsid w:val="00137804"/>
     <w:rPr>
       <w:i/>
       <w:iCs/>
@@ -5472,7 +5680,7 @@
     <w:basedOn w:val="Normal"/>
     <w:uiPriority w:val="34"/>
     <w:qFormat/>
-    <w:rsid w:val="0026198B"/>
+    <w:rsid w:val="00137804"/>
     <w:pPr>
       <w:ind w:left="720"/>
       <w:contextualSpacing/>
@@ -5483,7 +5691,7 @@
     <w:basedOn w:val="DefaultParagraphFont"/>
     <w:uiPriority w:val="21"/>
     <w:qFormat/>
-    <w:rsid w:val="0026198B"/>
+    <w:rsid w:val="00137804"/>
     <w:rPr>
       <w:i/>
       <w:iCs/>
@@ -5497,7 +5705,7 @@
     <w:link w:val="IntenseQuoteChar"/>
     <w:uiPriority w:val="30"/>
     <w:qFormat/>
-    <w:rsid w:val="0026198B"/>
+    <w:rsid w:val="00137804"/>
     <w:pPr>
       <w:pBdr>
         <w:top w:val="single" w:sz="4" w:space="10" w:color="0F4761" w:themeColor="accent1" w:themeShade="BF"/>
@@ -5518,7 +5726,7 @@
     <w:basedOn w:val="DefaultParagraphFont"/>
     <w:link w:val="IntenseQuote"/>
     <w:uiPriority w:val="30"/>
-    <w:rsid w:val="0026198B"/>
+    <w:rsid w:val="00137804"/>
     <w:rPr>
       <w:i/>
       <w:iCs/>
@@ -5530,7 +5738,7 @@
     <w:basedOn w:val="DefaultParagraphFont"/>
     <w:uiPriority w:val="32"/>
     <w:qFormat/>
-    <w:rsid w:val="0026198B"/>
+    <w:rsid w:val="00137804"/>
     <w:rPr>
       <w:b/>
       <w:bCs/>
@@ -5545,7 +5753,7 @@
     <w:link w:val="HeaderChar"/>
     <w:uiPriority w:val="99"/>
     <w:unhideWhenUsed/>
-    <w:rsid w:val="0026198B"/>
+    <w:rsid w:val="00137804"/>
     <w:pPr>
       <w:tabs>
         <w:tab w:val="center" w:pos="4419"/>
@@ -5559,7 +5767,7 @@
     <w:basedOn w:val="DefaultParagraphFont"/>
     <w:link w:val="Header"/>
     <w:uiPriority w:val="99"/>
-    <w:rsid w:val="0026198B"/>
+    <w:rsid w:val="00137804"/>
     <w:rPr>
       <w:rFonts w:ascii="Trebuchet MS" w:hAnsi="Trebuchet MS"/>
       <w:sz w:val="22"/>
@@ -5571,7 +5779,7 @@
     <w:link w:val="FooterChar"/>
     <w:uiPriority w:val="99"/>
     <w:unhideWhenUsed/>
-    <w:rsid w:val="0026198B"/>
+    <w:rsid w:val="00137804"/>
     <w:pPr>
       <w:tabs>
         <w:tab w:val="center" w:pos="4419"/>
@@ -5585,7 +5793,7 @@
     <w:basedOn w:val="DefaultParagraphFont"/>
     <w:link w:val="Footer"/>
     <w:uiPriority w:val="99"/>
-    <w:rsid w:val="0026198B"/>
+    <w:rsid w:val="00137804"/>
     <w:rPr>
       <w:rFonts w:ascii="Trebuchet MS" w:hAnsi="Trebuchet MS"/>
       <w:sz w:val="22"/>
@@ -5597,7 +5805,7 @@
     <w:uiPriority w:val="99"/>
     <w:semiHidden/>
     <w:unhideWhenUsed/>
-    <w:rsid w:val="0026198B"/>
+    <w:rsid w:val="00137804"/>
   </w:style>
   <w:style w:type="paragraph" w:styleId="TOC1">
     <w:name w:val="toc 1"/>
@@ -5606,7 +5814,7 @@
     <w:autoRedefine/>
     <w:uiPriority w:val="39"/>
     <w:unhideWhenUsed/>
-    <w:rsid w:val="0026198B"/>
+    <w:rsid w:val="00137804"/>
     <w:pPr>
       <w:spacing w:after="100"/>
     </w:pPr>
@@ -5618,7 +5826,7 @@
     <w:autoRedefine/>
     <w:uiPriority w:val="39"/>
     <w:unhideWhenUsed/>
-    <w:rsid w:val="0026198B"/>
+    <w:rsid w:val="00137804"/>
     <w:pPr>
       <w:spacing w:after="100"/>
       <w:ind w:left="220"/>
@@ -5631,7 +5839,7 @@
     <w:autoRedefine/>
     <w:uiPriority w:val="39"/>
     <w:unhideWhenUsed/>
-    <w:rsid w:val="0026198B"/>
+    <w:rsid w:val="00137804"/>
     <w:pPr>
       <w:spacing w:after="100"/>
       <w:ind w:left="440"/>

</xml_diff>